<commit_message>
Update project documents and assets
</commit_message>
<xml_diff>
--- a/MEMOIRE/Memoire_EduTrack_aya_mbk2.docx
+++ b/MEMOIRE/Memoire_EduTrack_aya_mbk2.docx
@@ -1095,7 +1095,7 @@
       </w:r>
       <w:r>
         <w:br/>
-        <w:t>- Le cahier de textes électronique ;</w:t>
+        <w:t>- Le Fiche de progression électronique ;</w:t>
       </w:r>
       <w:r>
         <w:br/>
@@ -1281,7 +1281,7 @@
       </w:r>
       <w:r>
         <w:br/>
-        <w:t>- Cahier de textes électronique ;</w:t>
+        <w:t>- Fiche de progression électronique ;</w:t>
       </w:r>
       <w:r>
         <w:br/>
@@ -1378,7 +1378,7 @@
       </w:r>
       <w:r>
         <w:br/>
-        <w:t>Le diagramme de cas d'utilisation identifie les interactions entre les acteurs du système (administrateur et enseignant) et les fonctionnalités disponibles. L'administrateur peut gérer les référentiels, planifier les séances, générer les QR codes, consulter les statistiques et gérer les honoraires. L'enseignant peut consulter son planning, scanner les QR codes pour émarger, renseigner son cahier de textes et consulter son historique et ses honoraires.</w:t>
+        <w:t>Le diagramme de cas d'utilisation identifie les interactions entre les acteurs du système (administrateur et enseignant) et les fonctionnalités disponibles. L'administrateur peut gérer les référentiels, planifier les séances, générer les QR codes, consulter les statistiques et gérer les honoraires. L'enseignant peut consulter son planning, scanner les QR codes pour émarger, renseigner sa Fiche de progression et consulter son historique et ses honoraires.</w:t>
       </w:r>
       <w:r>
         <w:br/>

</xml_diff>

<commit_message>
Améliore le mémoire et la soutenance EduTrack
</commit_message>
<xml_diff>
--- a/MEMOIRE/Memoire_EduTrack_aya_mbk2.docx
+++ b/MEMOIRE/Memoire_EduTrack_aya_mbk2.docx
@@ -194,7 +194,7 @@
         <w:rPr>
           <w:b/>
         </w:rPr>
-        <w:t>[Nom du Directeur de mémoire]</w:t>
+        <w:t>Nom du Directeur de mémoire : À compléter</w:t>
       </w:r>
     </w:p>
     <w:p/>
@@ -296,7 +296,7 @@
       </w:r>
       <w:r>
         <w:br/>
-        <w:t>Nous remercions tout d'abord notre Directeur de mémoire, Monsieur/Madame [Nom], pour sa disponibilité, ses conseils éclairés et son accompagnement rigoureux tout au long de ce travail. Sa patience et sa rigueur académique ont été d'une aide précieuse.</w:t>
+        <w:t>Nous remercions tout d'abord notre Directeur de mémoire, Monsieur/Madame le Directeur de mémoire (nom à compléter), pour sa disponibilité, ses conseils éclairés et son accompagnement rigoureux tout au long de ce travail. Sa patience et sa rigueur académique ont été d'une aide précieuse.</w:t>
       </w:r>
       <w:r>
         <w:br/>
@@ -442,6 +442,123 @@
           <w:b/>
           <w:sz w:val="32"/>
         </w:rPr>
+        <w:t xml:space="preserve">Table des illustrations</w:t>
+      </w:r>
+    </w:p>
+    <w:p>
+      <w:r>
+        <w:t xml:space="preserve">Figure 1 : Diagramme de cas d’utilisation du système EduTrack</w:t>
+      </w:r>
+    </w:p>
+    <w:p>
+      <w:r>
+        <w:t xml:space="preserve">Figure 2 : Architecture en trois couches du système EduTrack</w:t>
+      </w:r>
+    </w:p>
+    <w:p>
+      <w:r>
+        <w:rPr>
+          <w:i/>
+        </w:rPr>
+        <w:t xml:space="preserve">Source : élaboré par les auteurs à partir de l’architecture technique du projet.</w:t>
+      </w:r>
+    </w:p>
+    <w:p>
+      <w:r>
+        <w:t xml:space="preserve">Figure 3 : Diagramme de classes du modèle de données EduTrack</w:t>
+      </w:r>
+    </w:p>
+    <w:p>
+      <w:r>
+        <w:rPr>
+          <w:i/>
+        </w:rPr>
+        <w:t xml:space="preserve">Source : élaboré par les auteurs à partir du modèle de données de l’application.</w:t>
+      </w:r>
+    </w:p>
+    <w:p>
+      <w:r>
+        <w:t xml:space="preserve">Figure 4 : Diagramme de séquence du processus d’émargement par QR Code</w:t>
+      </w:r>
+    </w:p>
+    <w:p>
+      <w:r>
+        <w:rPr>
+          <w:b/>
+          <w:sz w:val="32"/>
+        </w:rPr>
+        <w:t xml:space="preserve">Table des sigles et abréviations</w:t>
+      </w:r>
+    </w:p>
+    <w:p>
+      <w:r>
+        <w:t xml:space="preserve">API : Application Programming Interface</w:t>
+      </w:r>
+    </w:p>
+    <w:p>
+      <w:r>
+        <w:t xml:space="preserve">CRUD : Create, Read, Update, Delete</w:t>
+      </w:r>
+    </w:p>
+    <w:p>
+      <w:r>
+        <w:t xml:space="preserve">DTO : Data Transfer Object</w:t>
+      </w:r>
+    </w:p>
+    <w:p>
+      <w:r>
+        <w:t xml:space="preserve">JPA : Jakarta Persistence API</w:t>
+      </w:r>
+    </w:p>
+    <w:p>
+      <w:r>
+        <w:t xml:space="preserve">JWT : JSON Web Token</w:t>
+      </w:r>
+    </w:p>
+    <w:p>
+      <w:r>
+        <w:t xml:space="preserve">ORM : Object-Relational Mapping</w:t>
+      </w:r>
+    </w:p>
+    <w:p>
+      <w:r>
+        <w:t xml:space="preserve">REST : Representational State Transfer</w:t>
+      </w:r>
+    </w:p>
+    <w:p>
+      <w:r>
+        <w:t xml:space="preserve">SPA : Single Page Application</w:t>
+      </w:r>
+    </w:p>
+    <w:p>
+      <w:r>
+        <w:t xml:space="preserve">SQL : Structured Query Language</w:t>
+      </w:r>
+    </w:p>
+    <w:p>
+      <w:r>
+        <w:t xml:space="preserve">UML : Unified Modeling Language</w:t>
+      </w:r>
+    </w:p>
+    <w:p>
+      <w:r>
+        <w:t xml:space="preserve">UX : User Experience</w:t>
+      </w:r>
+    </w:p>
+    <w:p>
+      <w:r>
+        <w:br w:type="page"/>
+      </w:r>
+      <w:r>
+        <w:t xml:space="preserve"/>
+      </w:r>
+    </w:p>
+    <w:p>
+      <w:r>
+        <w:rPr>
+          <w:b/>
+          <w:sz w:val="32"/>
+        </w:rPr>
         <w:lastRenderedPageBreak/>
         <w:t>Résumé</w:t>
       </w:r>
@@ -478,6 +595,48 @@
       <w:r>
         <w:br/>
         <w:t>Mots-clés : Suivi pédagogique, gestion des honoraires, Spring Boot, Angular, Ionic, émargement électronique, QR code.</w:t>
+      </w:r>
+    </w:p>
+    <w:p>
+      <w:r>
+        <w:br w:type="page"/>
+      </w:r>
+      <w:r>
+        <w:t xml:space="preserve"/>
+      </w:r>
+    </w:p>
+    <w:p>
+      <w:r>
+        <w:rPr>
+          <w:b/>
+          <w:sz w:val="32"/>
+        </w:rPr>
+        <w:t xml:space="preserve">Abstract</w:t>
+      </w:r>
+    </w:p>
+    <w:p>
+      <w:r>
+        <w:t xml:space="preserve">This dissertation presents the design and development of EduTrack, an integrated system for pedagogical monitoring and the management of teachers’ fees. The system addresses the growing need of higher education institutions for modern digital tools that improve the monitoring of teaching activities and ensure more transparent management of teachers’ remuneration.</w:t>
+      </w:r>
+    </w:p>
+    <w:p>
+      <w:r>
+        <w:t xml:space="preserve">EduTrack is composed of three main components: a backend developed with Spring Boot 3.4.3 and Java, exposing a REST API secured with JWT; a web administration interface built with Angular 21 and PrimeNG; and a mobile application developed with Ionic 8 and Capacitor, designed for teachers to scan QR codes, consult their schedule and manage their pedagogical activities.</w:t>
+      </w:r>
+    </w:p>
+    <w:p>
+      <w:r>
+        <w:t xml:space="preserve">The system includes features such as the management of classes, subjects, departments, study programs, classrooms and academic years, timetable planning, electronic attendance through QR codes, pedagogical progress monitoring, automated calculation of teachers’ fees and statistical reporting.</w:t>
+      </w:r>
+    </w:p>
+    <w:p>
+      <w:r>
+        <w:t xml:space="preserve">The methodology combines documentary research, functional analysis, UML modeling, iterative software development and functional validation of the implemented modules. The results show that EduTrack provides a coherent and practical solution for improving pedagogical and administrative processes.</w:t>
+      </w:r>
+    </w:p>
+    <w:p>
+      <w:r>
+        <w:t xml:space="preserve">Keywords: Pedagogical monitoring, teachers’ fees management, Spring Boot, Angular, Ionic, electronic attendance, QR code.</w:t>
       </w:r>
     </w:p>
     <w:p>
@@ -546,6 +705,109 @@
     </w:p>
     <w:p>
       <w:r>
+        <w:rPr>
+          <w:b/>
+          <w:sz w:val="28"/>
+        </w:rPr>
+        <w:t xml:space="preserve">Méthodologie de travail</w:t>
+      </w:r>
+    </w:p>
+    <w:p>
+      <w:r>
+        <w:t xml:space="preserve">La méthodologie adoptée repose sur une démarche à la fois documentaire, analytique et pratique. La première étape a consisté à exploiter des sources documentaires relatives au suivi pédagogique, à la gestion des honoraires, aux architectures REST et aux technologies web et mobiles.</w:t>
+      </w:r>
+    </w:p>
+    <w:p>
+      <w:r>
+        <w:t xml:space="preserve">La deuxième étape a porté sur l’analyse des besoins des principaux acteurs du système, notamment l’administrateur et l’enseignant. Cette analyse a permis d’identifier les modules fonctionnels prioritaires : authentification, gestion des référentiels académiques, planification, génération de QR codes, émargement, fiche de progression, honoraires et statistiques.</w:t>
+      </w:r>
+    </w:p>
+    <w:p>
+      <w:r>
+        <w:t xml:space="preserve">La troisième étape a concerné la modélisation du système à l’aide des diagrammes UML, afin de représenter les cas d’utilisation, les principales entités métier, les interactions et l’architecture globale.</w:t>
+      </w:r>
+    </w:p>
+    <w:p>
+      <w:r>
+        <w:t xml:space="preserve">La quatrième étape a été consacrée au développement itératif des trois composants de la solution : le backend Spring Boot, l’interface web Angular et l’application mobile Ionic. Chaque module a été validé progressivement à travers des scénarios fonctionnels.</w:t>
+      </w:r>
+    </w:p>
+    <w:p>
+      <w:r>
+        <w:t xml:space="preserve">Enfin, la validation a consisté à vérifier les principaux parcours utilisateurs : connexion, gestion des données académiques, planification d’une séance, génération du QR code, émargement mobile, remplissage de la fiche de progression, consultation du planning et calcul des honoraires.</w:t>
+      </w:r>
+    </w:p>
+    <w:p>
+      <w:r>
+        <w:rPr>
+          <w:b/>
+          <w:sz w:val="28"/>
+        </w:rPr>
+        <w:t xml:space="preserve">Questions de recherche, objectifs et hypothèses</w:t>
+      </w:r>
+    </w:p>
+    <w:p>
+      <w:r>
+        <w:t xml:space="preserve">Question principale : Comment un système numérique intégré peut-il améliorer le suivi pédagogique et la gestion des honoraires des enseignants à l’INTEC SUP ?</w:t>
+      </w:r>
+    </w:p>
+    <w:p>
+      <w:r>
+        <w:t xml:space="preserve">Questions spécifiques :</w:t>
+      </w:r>
+    </w:p>
+    <w:p>
+      <w:r>
+        <w:t xml:space="preserve">1. Comment centraliser les données pédagogiques afin de réduire les erreurs et les pertes d’information ?</w:t>
+      </w:r>
+    </w:p>
+    <w:p>
+      <w:r>
+        <w:t xml:space="preserve">2. Comment automatiser l’émargement des enseignants à partir d’un mécanisme fiable et traçable ?</w:t>
+      </w:r>
+    </w:p>
+    <w:p>
+      <w:r>
+        <w:t xml:space="preserve">3. Comment calculer les honoraires à partir des séances réellement effectuées ?</w:t>
+      </w:r>
+    </w:p>
+    <w:p>
+      <w:r>
+        <w:t xml:space="preserve">4. Comment offrir aux administrateurs et aux enseignants une interface simple, sécurisée et adaptée à leurs besoins ?</w:t>
+      </w:r>
+    </w:p>
+    <w:p>
+      <w:r>
+        <w:t xml:space="preserve">Objectif général : Concevoir et développer une plateforme web et mobile permettant d’automatiser le suivi pédagogique, l’émargement des enseignants et la gestion des honoraires.</w:t>
+      </w:r>
+    </w:p>
+    <w:p>
+      <w:r>
+        <w:t xml:space="preserve">Objectifs spécifiques : analyser les besoins fonctionnels du système ; concevoir une architecture web et mobile sécurisée ; développer une API REST avec Spring Boot ; développer une interface web administrateur avec Angular ; développer une application mobile enseignant avec Ionic ; intégrer l’émargement par QR code ; automatiser le calcul des honoraires ; valider le système par des tests fonctionnels.</w:t>
+      </w:r>
+    </w:p>
+    <w:p>
+      <w:r>
+        <w:t xml:space="preserve">Hypothèse 1 : La centralisation des données pédagogiques améliore la fiabilité du suivi administratif.</w:t>
+      </w:r>
+    </w:p>
+    <w:p>
+      <w:r>
+        <w:t xml:space="preserve">Hypothèse 2 : L’émargement électronique par QR code réduit les erreurs liées aux feuilles de présence papier.</w:t>
+      </w:r>
+    </w:p>
+    <w:p>
+      <w:r>
+        <w:t xml:space="preserve">Hypothèse 3 : L’automatisation du calcul des honoraires améliore la transparence et la rapidité du traitement.</w:t>
+      </w:r>
+    </w:p>
+    <w:p>
+      <w:r>
+        <w:t xml:space="preserve">Indicateurs retenus : disponibilité des données pédagogiques, nombre de séances planifiées, nombre d’émargements validés, taux de présence, volume horaire effectué, montant des honoraires calculés, temps de traitement administratif et satisfaction des utilisateurs lors des validations fonctionnelles.</w:t>
+      </w:r>
+    </w:p>
+    <w:p>
+      <w:r>
         <w:br w:type="page"/>
       </w:r>
     </w:p>
@@ -1095,7 +1357,7 @@
       </w:r>
       <w:r>
         <w:br/>
-        <w:t>- Le Fiche de progression électronique ;</w:t>
+        <w:t>- La fiche de progression électronique ;</w:t>
       </w:r>
       <w:r>
         <w:br/>
@@ -1463,6 +1725,14 @@
           <w:sz w:val="20"/>
         </w:rPr>
         <w:t>Figure 1 : Diagramme de cas d'utilisation du système EduTrack</w:t>
+      </w:r>
+    </w:p>
+    <w:p>
+      <w:r>
+        <w:rPr>
+          <w:i/>
+        </w:rPr>
+        <w:t xml:space="preserve">Source : élaboré par les auteurs à partir des besoins fonctionnels d’EduTrack.</w:t>
       </w:r>
     </w:p>
     <w:p>
@@ -1627,96 +1897,57 @@
     </w:p>
     <w:p>
       <w:r>
-        <w:t>Le modèle de données d'EduTrack a été conçu pour répondre aux exigences fonctionnelles identifiées. Il comprend les principales entités suivantes, avec leurs relations :</w:t>
-      </w:r>
-      <w:r>
-        <w:br/>
-      </w:r>
-      <w:r>
-        <w:br/>
-        <w:t>Un Département regroupe plusieurs Filières, qui elles-mêmes sont associées à des Niveaux d'Enseignement. Chaque combinaison de Filière et Niveau constitue une Classe. Les Matières sont associées aux Classes via les emplois du temps.</w:t>
-      </w:r>
-      <w:r>
-        <w:br/>
-      </w:r>
-      <w:r>
-        <w:br/>
-        <w:t>Un Enseignant (sous-type d'Utilisateur) est caractérisé par un matricule, un grade, une spécialité et une date d'embauche. Il peut être affecté à plusieurs séances.</w:t>
-      </w:r>
-      <w:r>
-        <w:br/>
-      </w:r>
-      <w:r>
-        <w:br/>
-        <w:t>Une Séance est planifiée dans le cadre d'un EmploiDuTemps, avec des informations sur la date, la classe, la matière, la salle, l'enseignant, le type de récurrence et le statut de la séance.</w:t>
-      </w:r>
-      <w:r>
-        <w:br/>
-      </w:r>
-      <w:r>
-        <w:br/>
-        <w:t xml:space="preserve">Un Emargement est associé à une Séance et enregistre la présence de l'enseignant avec un code </w:t>
-      </w:r>
-      <w:r>
-        <w:lastRenderedPageBreak/>
-        <w:t>QR, une date de scan, un statut (valide, en retard, absent) et une localisation éventuelle.</w:t>
-      </w:r>
-      <w:r>
-        <w:br/>
-      </w:r>
-      <w:r>
-        <w:br/>
-        <w:t>Les Fiches de Progression sont liées aux séances et permettent de suivre l'avancement du programme pédagogique.</w:t>
-      </w:r>
-      <w:r>
-        <w:br/>
-      </w:r>
-      <w:r>
-        <w:br/>
-        <w:t>Le calcul des Honoraires est basé sur les heures effectuées, avec des lignes d'honoraires détaillant le nombre d'heures, le taux applicable et le montant calculé pour chaque enseignant et chaque période.</w:t>
-      </w:r>
-      <w:r>
-        <w:br/>
-      </w:r>
-      <w:r>
-        <w:br/>
-        <w:t>L'API REST expose des endpoints pour chaque entité, organisés par ressource :</w:t>
-      </w:r>
-      <w:r>
-        <w:br/>
-        <w:t>- /api/auth/* : Authentification et gestion des tokens JWT ;</w:t>
-      </w:r>
-      <w:r>
-        <w:br/>
-        <w:t>- /api/utilisateurs/* : Gestion des utilisateurs ;</w:t>
-      </w:r>
-      <w:r>
-        <w:br/>
-        <w:t>- /api/enseignants/* : Gestion des enseignants ;</w:t>
-      </w:r>
-      <w:r>
-        <w:br/>
-        <w:t>- /api/classes/*, /api/matieres/*, /api/filieres/*, etc. : Gestion des référentiels ;</w:t>
-      </w:r>
-      <w:r>
-        <w:br/>
-        <w:t>- /api/emplois-du-temps/*, /api/seances/* : Planification ;</w:t>
-      </w:r>
-      <w:r>
-        <w:br/>
-        <w:t>- /api/emargements/* : Gestion des émargements ;</w:t>
-      </w:r>
-      <w:r>
-        <w:br/>
-        <w:t>- /api/qrcodes/* : Génération des QR codes ;</w:t>
-      </w:r>
-      <w:r>
-        <w:br/>
-        <w:t>- /api/honoraires/* : Gestion des honoraires ;</w:t>
-      </w:r>
-      <w:r>
-        <w:br/>
-        <w:t>- /api/fiches-progression/* : Suivi pédagogique.</w:t>
+        <w:t xml:space="preserve">L’API REST expose des endpoints organisés par ressource :</w:t>
+      </w:r>
+    </w:p>
+    <w:p>
+      <w:r>
+        <w:t xml:space="preserve">- /api/auth/* : authentification, gestion des tokens JWT et réinitialisation du mot de passe ;</w:t>
+      </w:r>
+    </w:p>
+    <w:p>
+      <w:r>
+        <w:t xml:space="preserve">- /api/utilisateurs/* : gestion des utilisateurs et des enseignants, y compris l’import Excel des enseignants ;</w:t>
+      </w:r>
+    </w:p>
+    <w:p>
+      <w:r>
+        <w:t xml:space="preserve">- /api/classes, /api/matieres, /api/filieres, /api/departements, /api/niveau-enseignement, /api/salles et /api/annee-universitaire : gestion des référentiels académiques ;</w:t>
+      </w:r>
+    </w:p>
+    <w:p>
+      <w:r>
+        <w:t xml:space="preserve">- /api/emploi-du-temps et /api/seances : planification et gestion des séances ;</w:t>
+      </w:r>
+    </w:p>
+    <w:p>
+      <w:r>
+        <w:t xml:space="preserve">- /api/seances/{id}/qr-code : génération et consultation du QR code d’une séance ;</w:t>
+      </w:r>
+    </w:p>
+    <w:p>
+      <w:r>
+        <w:t xml:space="preserve">- /api/ecrans/salles/{tokenAffichage}/qr-actif : affichage du QR code actif d’une salle ;</w:t>
+      </w:r>
+    </w:p>
+    <w:p>
+      <w:r>
+        <w:t xml:space="preserve">- /api/emargements/scan : enregistrement de l’émargement à partir du QR code scanné ;</w:t>
+      </w:r>
+    </w:p>
+    <w:p>
+      <w:r>
+        <w:t xml:space="preserve">- /api/fiche-progression : suivi pédagogique et remplissage des fiches de progression ;</w:t>
+      </w:r>
+    </w:p>
+    <w:p>
+      <w:r>
+        <w:t xml:space="preserve">- /api/honoraires/* : calcul et consultation des honoraires ;</w:t>
+      </w:r>
+    </w:p>
+    <w:p>
+      <w:r>
+        <w:t xml:space="preserve">- /api/dashboard/* et /api/export/* : statistiques et exports PDF/Excel.</w:t>
       </w:r>
     </w:p>
     <w:p>
@@ -2087,6 +2318,14 @@
     <w:p>
       <w:r>
         <w:rPr>
+          <w:i/>
+        </w:rPr>
+        <w:t xml:space="preserve">Source : élaboré par les auteurs à partir du scénario d’émargement mobile.</w:t>
+      </w:r>
+    </w:p>
+    <w:p>
+      <w:r>
+        <w:rPr>
           <w:b/>
           <w:i/>
         </w:rPr>
@@ -2095,53 +2334,22 @@
     </w:p>
     <w:p>
       <w:r>
-        <w:t>La phase de tests et de validation est essentielle pour garantir la qualité et la fiabilité du système EduTrack. Plusieurs types de tests ont été réalisés :</w:t>
-      </w:r>
-      <w:r>
-        <w:br/>
-      </w:r>
-      <w:r>
-        <w:br/>
-        <w:t>Les tests unitaires ont été écrits pour vérifier le bon fonctionnement des services et des contrôleurs backend. Spring Boot fournit un support complet pour les tests avec @SpringBootTest, @WebMvcTest et @DataJpaTest.</w:t>
-      </w:r>
-      <w:r>
-        <w:br/>
-      </w:r>
-      <w:r>
-        <w:br/>
-        <w:t>Les tests d'intégration ont permis de valider les interactions entre les différentes couches du système : communication entre le frontend et le backend via les endpoints REST, persistance et récupération des données en base, et flux d'authentification complet.</w:t>
-      </w:r>
-      <w:r>
-        <w:br/>
-      </w:r>
-      <w:r>
-        <w:br/>
-        <w:t xml:space="preserve">Les tests fonctionnels ont été réalisés pour vérifier que chaque fonctionnalité répond aux </w:t>
-      </w:r>
-      <w:r>
-        <w:lastRenderedPageBreak/>
-        <w:t>spécifications définies : création d'un enseignant, planification d'une séance, génération d'un QR code, scan et émargement, calcul des honoraires.</w:t>
-      </w:r>
-      <w:r>
-        <w:br/>
-      </w:r>
-      <w:r>
-        <w:br/>
-        <w:t>Les tests de sécurité ont porté sur la validation des tokens JWT, la protection des endpoints par rôle, et la prévention des accès non autorisés.</w:t>
-      </w:r>
-      <w:r>
-        <w:br/>
-      </w:r>
-      <w:r>
-        <w:br/>
-        <w:t>Les tests de performance ont été effectués pour s'assurer que les temps de réponse de l'API restent acceptables, même en cas de charge importante.</w:t>
-      </w:r>
-      <w:r>
-        <w:br/>
-      </w:r>
-      <w:r>
-        <w:br/>
-        <w:t>Enfin, des tests utilisateurs ont été menés avec des enseignants et des administrateurs pour valider l'ergonomie et l'expérience utilisateur des interfaces web et mobile.</w:t>
+        <w:t xml:space="preserve">La phase de tests et de validation est essentielle pour garantir la qualité et la fiabilité du système EduTrack. Dans le cadre de ce projet, la validation a combiné un test automatisé de démarrage du backend et des vérifications fonctionnelles manuelles sur les principaux scénarios utilisateurs.</w:t>
+      </w:r>
+    </w:p>
+    <w:p>
+      <w:r>
+        <w:t xml:space="preserve">Le backend comporte un test automatisé de chargement du contexte Spring Boot avec le profil de test et une base H2 en mémoire. Ce test permet de vérifier que la configuration principale de l’application, les repositories, les services et la sécurité peuvent être initialisés correctement.</w:t>
+      </w:r>
+    </w:p>
+    <w:p>
+      <w:r>
+        <w:t xml:space="preserve">Les validations fonctionnelles ont porté sur les parcours suivants : authentification, gestion des référentiels académiques, création d’un emploi du temps, génération d’une séance, génération du QR code, scan du QR code depuis l’application mobile, enregistrement de l’émargement, remplissage de la fiche de progression et consultation des honoraires.</w:t>
+      </w:r>
+    </w:p>
+    <w:p>
+      <w:r>
+        <w:t xml:space="preserve">Les interfaces web et mobile ont également été compilées afin de vérifier la cohérence technique des applications clientes. Ces validations constituent une première base de contrôle qualité, qui pourra être renforcée par des tests unitaires, des tests d’intégration et des tests de sécurité plus complets dans les évolutions futures du projet.</w:t>
       </w:r>
     </w:p>
     <w:p>
@@ -2222,6 +2430,30 @@
       <w:r>
         <w:br/>
         <w:t>En conclusion, EduTrack constitue une solution complète et moderne pour la gestion pédagogique et administrative de l'INTEC SUP. Il démontre comment les technologies web et mobiles contemporaines peuvent être mises au service de l'amélioration des processus éducatifs, contribuant ainsi à la transformation numérique de l'enseignement supérieur au Mali.</w:t>
+      </w:r>
+    </w:p>
+    <w:p>
+      <w:r>
+        <w:rPr>
+          <w:b/>
+          <w:sz w:val="28"/>
+        </w:rPr>
+        <w:t xml:space="preserve">Recommandations</w:t>
+      </w:r>
+    </w:p>
+    <w:p>
+      <w:r>
+        <w:t xml:space="preserve">Au regard des résultats obtenus, plusieurs recommandations peuvent être formulées. Il est d’abord recommandé de renforcer progressivement les tests automatisés afin de couvrir les services métier, les contrôleurs REST, les règles de sécurité et les scénarios critiques liés à l’émargement et au calcul des honoraires.</w:t>
+      </w:r>
+    </w:p>
+    <w:p>
+      <w:r>
+        <w:t xml:space="preserve">Il est également recommandé de sécuriser davantage la configuration de production, notamment en externalisant les mots de passe, les secrets JWT et les paramètres de connexion à la base de données dans des variables d’environnement.</w:t>
+      </w:r>
+    </w:p>
+    <w:p>
+      <w:r>
+        <w:t xml:space="preserve">Enfin, l’intégration de notifications, d’un module étudiant et d’un tableau de bord analytique plus avancé permettrait d’améliorer l’exploitation pédagogique des données collectées par le système.</w:t>
       </w:r>
     </w:p>
     <w:p>

</xml_diff>